<commit_message>
Updated Authorization/Role Manager and Registration Manager documents to fix formatting errors
</commit_message>
<xml_diff>
--- a/03_Team_Work/Team4/Milestone_3_Components/Working/ZH_M3_Team4_AuthorizationRoleManagerEI_v01.docx
+++ b/03_Team_Work/Team4/Milestone_3_Components/Working/ZH_M3_Team4_AuthorizationRoleManagerEI_v01.docx
@@ -5,6 +5,8 @@
     <w:p>
       <w:pPr>
         <w:pStyle w:val="font-claude-response-body"/>
+        <w:spacing w:before="240" w:beforeAutospacing="0" w:after="80" w:afterAutospacing="0"/>
+        <w:outlineLvl w:val="2"/>
         <w:rPr>
           <w:rFonts w:ascii="Arial" w:hAnsi="Arial" w:cs="Arial"/>
           <w:sz w:val="27"/>
@@ -24,56 +26,18 @@
     <w:p>
       <w:pPr>
         <w:pStyle w:val="font-claude-response-body"/>
+        <w:spacing w:before="240" w:beforeAutospacing="0" w:after="80" w:afterAutospacing="0"/>
+        <w:outlineLvl w:val="2"/>
         <w:rPr>
           <w:rFonts w:ascii="Arial" w:hAnsi="Arial" w:cs="Arial"/>
-          <w:sz w:val="27"/>
-          <w:szCs w:val="27"/>
         </w:rPr>
       </w:pPr>
       <w:r>
         <w:rPr>
           <w:rStyle w:val="Strong"/>
           <w:rFonts w:ascii="Arial" w:hAnsi="Arial" w:cs="Arial"/>
-          <w:sz w:val="27"/>
-          <w:szCs w:val="27"/>
         </w:rPr>
-        <w:t>EI Table 1.5.</w:t>
-      </w:r>
-      <w:r>
-        <w:rPr>
-          <w:rStyle w:val="Strong"/>
-          <w:rFonts w:ascii="Arial" w:hAnsi="Arial" w:cs="Arial"/>
-          <w:sz w:val="27"/>
-          <w:szCs w:val="27"/>
-        </w:rPr>
-        <w:t>2</w:t>
-      </w:r>
-      <w:r>
-        <w:rPr>
-          <w:rStyle w:val="Strong"/>
-          <w:rFonts w:ascii="Arial" w:hAnsi="Arial" w:cs="Arial"/>
-          <w:sz w:val="27"/>
-          <w:szCs w:val="27"/>
-        </w:rPr>
-        <w:t xml:space="preserve"> — </w:t>
-      </w:r>
-      <w:r>
-        <w:rPr>
-          <w:rStyle w:val="Strong"/>
-          <w:rFonts w:ascii="Arial" w:hAnsi="Arial" w:cs="Arial"/>
-          <w:sz w:val="27"/>
-          <w:szCs w:val="27"/>
-        </w:rPr>
-        <w:t>Authorization/Role</w:t>
-      </w:r>
-      <w:r>
-        <w:rPr>
-          <w:rStyle w:val="Strong"/>
-          <w:rFonts w:ascii="Arial" w:hAnsi="Arial" w:cs="Arial"/>
-          <w:sz w:val="27"/>
-          <w:szCs w:val="27"/>
-        </w:rPr>
-        <w:t xml:space="preserve"> Manager</w:t>
+        <w:t>EI Table 1.5.2 — Authorization/Role Manager</w:t>
       </w:r>
     </w:p>
     <w:tbl>

</xml_diff>